<commit_message>
Rename culturally insensitive / ableist game names (Castle Wall, Hoop Hut, Dodge Lane, Mongoose Tag, Three-Court Dodgeball, Wild Ball Soccer, Jumping Beans, ...); old anchors redirect, old names stay searchable
</commit_message>
<xml_diff>
--- a/grade-6-gymnastics-booklet.docx
+++ b/grade-6-gymnastics-booklet.docx
@@ -125,6 +125,8 @@
         <w:ind w:firstLine="973"/>
         <w:rPr/>
         <w:sectPr>
+          <w:headerReference w:type="default" r:id="rId7"/>
+          <w:footerReference w:type="default" r:id="rId8"/>
           <w:pgSz w:h="15840" w:w="12240" w:orient="portrait"/>
           <w:pgMar w:bottom="280" w:top="1820" w:left="1200" w:right="1180" w:header="360" w:footer="360"/>
           <w:pgNumType w:start="1"/>
@@ -4924,7 +4926,7 @@
           <w:vertAlign w:val="baseline"/>
           <w:rtl w:val="0"/>
         </w:rPr>
-        <w:t xml:space="preserve">Hip Rotation (hula)</w:t>
+        <w:t>Hip Rotation (hoop)</w:t>
       </w:r>
       <w:r>
         <w:rPr>
@@ -13672,7 +13674,7 @@
                 <w:vertAlign w:val="baseline"/>
                 <w:rtl w:val="0"/>
               </w:rPr>
-              <w:t xml:space="preserve">Hip Rotation (hula)</w:t>
+              <w:t>Hip Rotation (hoop)</w:t>
             </w:r>
             <w:r>
               <w:rPr>
@@ -29711,6 +29713,26 @@
     </w:sectPr>
   </w:body>
 </w:document>
+</file>
+
+<file path=word/footer1.xml><?xml version="1.0" encoding="utf-8"?>
+<w:ftr xmlns:m="http://schemas.openxmlformats.org/officeDocument/2006/math" xmlns:mc="http://schemas.openxmlformats.org/markup-compatibility/2006" xmlns:mo="http://schemas.microsoft.com/office/mac/office/2008/main" xmlns:mv="urn:schemas-microsoft-com:mac:vml" xmlns:o="urn:schemas-microsoft-com:office:office" xmlns:r="http://schemas.openxmlformats.org/officeDocument/2006/relationships" xmlns:v="urn:schemas-microsoft-com:vml" xmlns:w10="urn:schemas-microsoft-com:office:word" xmlns:w14="http://schemas.microsoft.com/office/word/2010/wordml" xmlns:w="http://schemas.openxmlformats.org/wordprocessingml/2006/main" xmlns:wne="http://schemas.microsoft.com/office/word/2006/wordml" xmlns:wp14="http://schemas.microsoft.com/office/word/2010/wordprocessingDrawing" xmlns:wp="http://schemas.openxmlformats.org/drawingml/2006/wordprocessingDrawing" xmlns:wpc="http://schemas.microsoft.com/office/word/2010/wordprocessingCanvas" xmlns:wpg="http://schemas.microsoft.com/office/word/2010/wordprocessingGroup" xmlns:wpi="http://schemas.microsoft.com/office/word/2010/wordprocessingInk" xmlns:wps="http://schemas.microsoft.com/office/word/2010/wordprocessingShape" mc:Ignorable="w14 wp14">
+  <w:p>
+    <w:pPr>
+      <w:pStyle w:val="Footer"/>
+    </w:pPr>
+  </w:p>
+</w:ftr>
+</file>
+
+<file path=word/header1.xml><?xml version="1.0" encoding="utf-8"?>
+<w:hdr xmlns:m="http://schemas.openxmlformats.org/officeDocument/2006/math" xmlns:mc="http://schemas.openxmlformats.org/markup-compatibility/2006" xmlns:mo="http://schemas.microsoft.com/office/mac/office/2008/main" xmlns:mv="urn:schemas-microsoft-com:mac:vml" xmlns:o="urn:schemas-microsoft-com:office:office" xmlns:r="http://schemas.openxmlformats.org/officeDocument/2006/relationships" xmlns:v="urn:schemas-microsoft-com:vml" xmlns:w10="urn:schemas-microsoft-com:office:word" xmlns:w14="http://schemas.microsoft.com/office/word/2010/wordml" xmlns:w="http://schemas.openxmlformats.org/wordprocessingml/2006/main" xmlns:wne="http://schemas.microsoft.com/office/word/2006/wordml" xmlns:wp14="http://schemas.microsoft.com/office/word/2010/wordprocessingDrawing" xmlns:wp="http://schemas.openxmlformats.org/drawingml/2006/wordprocessingDrawing" xmlns:wpc="http://schemas.microsoft.com/office/word/2010/wordprocessingCanvas" xmlns:wpg="http://schemas.microsoft.com/office/word/2010/wordprocessingGroup" xmlns:wpi="http://schemas.microsoft.com/office/word/2010/wordprocessingInk" xmlns:wps="http://schemas.microsoft.com/office/word/2010/wordprocessingShape" mc:Ignorable="w14 wp14">
+  <w:p>
+    <w:pPr>
+      <w:pStyle w:val="Header"/>
+    </w:pPr>
+  </w:p>
+</w:hdr>
 </file>
 
 <file path=word/numbering.xml><?xml version="1.0" encoding="utf-8"?>

</xml_diff>